<commit_message>
Brighten letterhead palette and add Russian letterhead version
Contacts and footer in brand navy instead of grey, more saturated gold
rules; new Russian variant (header, footer and body placeholders in
Russian) as DOCX template plus PDF samples for both languages.

Co-Authored-By: Claude Fable 5 <noreply@anthropic.com>
Claude-Session: https://claude.ai/code/session_01Vq5DsVLAzzVq2wVDgXMpUS
</commit_message>
<xml_diff>
--- a/strateon/STRATEON_Letterhead.docx
+++ b/strateon/STRATEON_Letterhead.docx
@@ -14,11 +14,11 @@
           <w:bCs w:val="false"/>
           <w:i w:val="false"/>
           <w:iCs w:val="false"/>
-          <w:color w:val="5A6A7A"/>
-          <w:sz w:val="21"/>
-          <w:szCs w:val="21"/>
-        </w:rPr>
-        <w:t xml:space="preserve">Ref.: [номер письма]</w:t>
+          <w:color w:val="16283C"/>
+          <w:sz w:val="21"/>
+          <w:szCs w:val="21"/>
+        </w:rPr>
+        <w:t xml:space="preserve">Ref.: [reference no.]</w:t>
       </w:r>
     </w:p>
     <w:p>
@@ -33,11 +33,11 @@
           <w:bCs w:val="false"/>
           <w:i w:val="false"/>
           <w:iCs w:val="false"/>
-          <w:color w:val="5A6A7A"/>
-          <w:sz w:val="21"/>
-          <w:szCs w:val="21"/>
-        </w:rPr>
-        <w:t xml:space="preserve">Date: [дата]</w:t>
+          <w:color w:val="16283C"/>
+          <w:sz w:val="21"/>
+          <w:szCs w:val="21"/>
+        </w:rPr>
+        <w:t xml:space="preserve">Date: [date]</w:t>
       </w:r>
     </w:p>
     <w:p>
@@ -56,7 +56,7 @@
           <w:sz w:val="21"/>
           <w:szCs w:val="21"/>
         </w:rPr>
-        <w:t xml:space="preserve">[Наименование компании-адресата]</w:t>
+        <w:t xml:space="preserve">[Addressee company name]</w:t>
       </w:r>
     </w:p>
     <w:p>
@@ -75,7 +75,7 @@
           <w:sz w:val="21"/>
           <w:szCs w:val="21"/>
         </w:rPr>
-        <w:t xml:space="preserve">[Имя, должность]</w:t>
+        <w:t xml:space="preserve">[Name, title]</w:t>
       </w:r>
     </w:p>
     <w:p>
@@ -94,7 +94,7 @@
           <w:sz w:val="21"/>
           <w:szCs w:val="21"/>
         </w:rPr>
-        <w:t xml:space="preserve">[Адрес / город, страна]</w:t>
+        <w:t xml:space="preserve">[Address / city, country]</w:t>
       </w:r>
     </w:p>
     <w:p>
@@ -113,7 +113,7 @@
           <w:sz w:val="21"/>
           <w:szCs w:val="21"/>
         </w:rPr>
-        <w:t xml:space="preserve">Subject: [тема письма]</w:t>
+        <w:t xml:space="preserve">Subject: [subject]</w:t>
       </w:r>
     </w:p>
     <w:p>
@@ -132,7 +132,7 @@
           <w:sz w:val="21"/>
           <w:szCs w:val="21"/>
         </w:rPr>
-        <w:t xml:space="preserve">Dear [Mr/Ms Last Name], / Уважаемый(ая) [Имя Отчество],</w:t>
+        <w:t xml:space="preserve">Dear [Mr/Ms Last Name],</w:t>
       </w:r>
     </w:p>
     <w:p>
@@ -151,7 +151,7 @@
           <w:sz w:val="21"/>
           <w:szCs w:val="21"/>
         </w:rPr>
-        <w:t xml:space="preserve">[Текст письма. Шаблон текста первого письма-предложения о встрече — в файле strateon/05-meeting-request-letter.md. Этот абзац и все подсказки в квадратных скобках заменяются содержанием письма.]</w:t>
+        <w:t xml:space="preserve">[Letter body. All bracketed hints are replaced with the letter content.]</w:t>
       </w:r>
     </w:p>
     <w:p>
@@ -170,7 +170,7 @@
           <w:sz w:val="21"/>
           <w:szCs w:val="21"/>
         </w:rPr>
-        <w:t xml:space="preserve">[Второй абзац.]</w:t>
+        <w:t xml:space="preserve">[Second paragraph.]</w:t>
       </w:r>
     </w:p>
     <w:p>
@@ -189,7 +189,7 @@
           <w:sz w:val="21"/>
           <w:szCs w:val="21"/>
         </w:rPr>
-        <w:t xml:space="preserve">Kind regards, / С уважением,</w:t>
+        <w:t xml:space="preserve">Kind regards,</w:t>
       </w:r>
     </w:p>
     <w:p>
@@ -242,7 +242,7 @@
           <w:bCs w:val="false"/>
           <w:i w:val="false"/>
           <w:iCs w:val="false"/>
-          <w:color w:val="5A6A7A"/>
+          <w:color w:val="16283C"/>
           <w:sz w:val="21"/>
           <w:szCs w:val="21"/>
         </w:rPr>
@@ -261,11 +261,11 @@
           <w:bCs w:val="false"/>
           <w:i/>
           <w:iCs/>
-          <w:color w:val="5A6A7A"/>
-          <w:sz w:val="21"/>
-          <w:szCs w:val="21"/>
-        </w:rPr>
-        <w:t xml:space="preserve">Enclosure: [приложения, если есть]</w:t>
+          <w:color w:val="16283C"/>
+          <w:sz w:val="21"/>
+          <w:szCs w:val="21"/>
+        </w:rPr>
+        <w:t xml:space="preserve">Enclosure: [attachments, if any]</w:t>
       </w:r>
     </w:p>
     <w:sectPr>
@@ -326,7 +326,7 @@
   <w:p>
     <w:pPr>
       <w:pBdr>
-        <w:top w:val="single" w:color="B98A2E" w:sz="8"/>
+        <w:top w:val="single" w:color="DFA02F" w:sz="12"/>
       </w:pBdr>
       <w:spacing w:before="60"/>
       <w:jc w:val="center"/>
@@ -334,7 +334,7 @@
     <w:r>
       <w:rPr>
         <w:rFonts w:ascii="Arial" w:cs="Arial" w:eastAsia="Arial" w:hAnsi="Arial"/>
-        <w:color w:val="5A6A7A"/>
+        <w:color w:val="16283C"/>
         <w:sz w:val="13"/>
         <w:szCs w:val="13"/>
       </w:rPr>
@@ -343,7 +343,7 @@
     <w:r>
       <w:rPr>
         <w:rFonts w:ascii="Arial" w:cs="Arial" w:eastAsia="Arial" w:hAnsi="Arial"/>
-        <w:color w:val="5A6A7A"/>
+        <w:color w:val="16283C"/>
         <w:sz w:val="13"/>
         <w:szCs w:val="13"/>
       </w:rPr>
@@ -485,7 +485,7 @@
           <w:r>
             <w:rPr>
               <w:rFonts w:ascii="Arial" w:cs="Arial" w:eastAsia="Arial" w:hAnsi="Arial"/>
-              <w:color w:val="5A6A7A"/>
+              <w:color w:val="16283C"/>
               <w:sz w:val="15"/>
               <w:szCs w:val="15"/>
             </w:rPr>
@@ -500,7 +500,7 @@
           <w:r>
             <w:rPr>
               <w:rFonts w:ascii="Arial" w:cs="Arial" w:eastAsia="Arial" w:hAnsi="Arial"/>
-              <w:color w:val="5A6A7A"/>
+              <w:color w:val="16283C"/>
               <w:sz w:val="15"/>
               <w:szCs w:val="15"/>
             </w:rPr>
@@ -515,7 +515,7 @@
           <w:r>
             <w:rPr>
               <w:rFonts w:ascii="Arial" w:cs="Arial" w:eastAsia="Arial" w:hAnsi="Arial"/>
-              <w:color w:val="5A6A7A"/>
+              <w:color w:val="16283C"/>
               <w:sz w:val="15"/>
               <w:szCs w:val="15"/>
             </w:rPr>
@@ -530,7 +530,7 @@
           <w:r>
             <w:rPr>
               <w:rFonts w:ascii="Arial" w:cs="Arial" w:eastAsia="Arial" w:hAnsi="Arial"/>
-              <w:color w:val="5A6A7A"/>
+              <w:color w:val="16283C"/>
               <w:sz w:val="15"/>
               <w:szCs w:val="15"/>
             </w:rPr>
@@ -545,7 +545,7 @@
           <w:r>
             <w:rPr>
               <w:rFonts w:ascii="Arial" w:cs="Arial" w:eastAsia="Arial" w:hAnsi="Arial"/>
-              <w:color w:val="5A6A7A"/>
+              <w:color w:val="16283C"/>
               <w:sz w:val="15"/>
               <w:szCs w:val="15"/>
             </w:rPr>
@@ -558,7 +558,7 @@
   <w:p>
     <w:pPr>
       <w:pBdr>
-        <w:bottom w:val="single" w:color="B98A2E" w:sz="14"/>
+        <w:bottom w:val="single" w:color="DFA02F" w:sz="20"/>
       </w:pBdr>
       <w:spacing w:after="0" w:before="120"/>
     </w:pPr>

</xml_diff>

<commit_message>
Strengthen letterhead colors for Word rendering parity with PDF
More saturated gold (#E8990C), thicker rules (4pt header / 2.25pt
footer), larger navy contact text and bold footer so the Word template
reads as vivid as the PDF sample; both language variants rebuilt.

Co-Authored-By: Claude Fable 5 <noreply@anthropic.com>
Claude-Session: https://claude.ai/code/session_01Vq5DsVLAzzVq2wVDgXMpUS
</commit_message>
<xml_diff>
--- a/strateon/STRATEON_Letterhead.docx
+++ b/strateon/STRATEON_Letterhead.docx
@@ -326,7 +326,7 @@
   <w:p>
     <w:pPr>
       <w:pBdr>
-        <w:top w:val="single" w:color="DFA02F" w:sz="12"/>
+        <w:top w:val="single" w:color="E8990C" w:sz="18"/>
       </w:pBdr>
       <w:spacing w:before="60"/>
       <w:jc w:val="center"/>
@@ -334,18 +334,22 @@
     <w:r>
       <w:rPr>
         <w:rFonts w:ascii="Arial" w:cs="Arial" w:eastAsia="Arial" w:hAnsi="Arial"/>
+        <w:b/>
+        <w:bCs/>
         <w:color w:val="16283C"/>
-        <w:sz w:val="13"/>
-        <w:szCs w:val="13"/>
+        <w:sz w:val="14"/>
+        <w:szCs w:val="14"/>
       </w:rPr>
       <w:t xml:space="preserve">S T R A T E O N   T R A D I N G   F Z C O</w:t>
     </w:r>
     <w:r>
       <w:rPr>
         <w:rFonts w:ascii="Arial" w:cs="Arial" w:eastAsia="Arial" w:hAnsi="Arial"/>
+        <w:b/>
+        <w:bCs/>
         <w:color w:val="16283C"/>
-        <w:sz w:val="13"/>
-        <w:szCs w:val="13"/>
+        <w:sz w:val="14"/>
+        <w:szCs w:val="14"/>
       </w:rPr>
       <w:t xml:space="preserve">   ·   DMCC Free Zone, Dubai, United Arab Emirates   ·   Trade Licence No. DMCC-1023898</w:t>
     </w:r>
@@ -486,8 +490,8 @@
             <w:rPr>
               <w:rFonts w:ascii="Arial" w:cs="Arial" w:eastAsia="Arial" w:hAnsi="Arial"/>
               <w:color w:val="16283C"/>
-              <w:sz w:val="15"/>
-              <w:szCs w:val="15"/>
+              <w:sz w:val="17"/>
+              <w:szCs w:val="17"/>
             </w:rPr>
             <w:t xml:space="preserve">Trade Licence No. DMCC-1023898</w:t>
           </w:r>
@@ -501,8 +505,8 @@
             <w:rPr>
               <w:rFonts w:ascii="Arial" w:cs="Arial" w:eastAsia="Arial" w:hAnsi="Arial"/>
               <w:color w:val="16283C"/>
-              <w:sz w:val="15"/>
-              <w:szCs w:val="15"/>
+              <w:sz w:val="17"/>
+              <w:szCs w:val="17"/>
             </w:rPr>
             <w:t xml:space="preserve">Unit 2572, Level 1, DMCC Business Centre,</w:t>
           </w:r>
@@ -516,8 +520,8 @@
             <w:rPr>
               <w:rFonts w:ascii="Arial" w:cs="Arial" w:eastAsia="Arial" w:hAnsi="Arial"/>
               <w:color w:val="16283C"/>
-              <w:sz w:val="15"/>
-              <w:szCs w:val="15"/>
+              <w:sz w:val="17"/>
+              <w:szCs w:val="17"/>
             </w:rPr>
             <w:t xml:space="preserve">Jewellery &amp; Gemplex 3, Dubai, UAE</w:t>
           </w:r>
@@ -531,8 +535,8 @@
             <w:rPr>
               <w:rFonts w:ascii="Arial" w:cs="Arial" w:eastAsia="Arial" w:hAnsi="Arial"/>
               <w:color w:val="16283C"/>
-              <w:sz w:val="15"/>
-              <w:szCs w:val="15"/>
+              <w:sz w:val="17"/>
+              <w:szCs w:val="17"/>
             </w:rPr>
             <w:t xml:space="preserve">+971 50 910 2570 · info@strateon.pro</w:t>
           </w:r>
@@ -546,8 +550,8 @@
             <w:rPr>
               <w:rFonts w:ascii="Arial" w:cs="Arial" w:eastAsia="Arial" w:hAnsi="Arial"/>
               <w:color w:val="16283C"/>
-              <w:sz w:val="15"/>
-              <w:szCs w:val="15"/>
+              <w:sz w:val="17"/>
+              <w:szCs w:val="17"/>
             </w:rPr>
             <w:t xml:space="preserve">www.strateon.pro</w:t>
           </w:r>
@@ -558,7 +562,7 @@
   <w:p>
     <w:pPr>
       <w:pBdr>
-        <w:bottom w:val="single" w:color="DFA02F" w:sz="20"/>
+        <w:bottom w:val="single" w:color="E8990C" w:sz="32"/>
       </w:pBdr>
       <w:spacing w:after="0" w:before="120"/>
     </w:pPr>

</xml_diff>

<commit_message>
Match letterhead gold to the information sheet brand tone (#C9973B)
Co-Authored-By: Claude Fable 5 <noreply@anthropic.com>
Claude-Session: https://claude.ai/code/session_01Vq5DsVLAzzVq2wVDgXMpUS
</commit_message>
<xml_diff>
--- a/strateon/STRATEON_Letterhead.docx
+++ b/strateon/STRATEON_Letterhead.docx
@@ -326,7 +326,7 @@
   <w:p>
     <w:pPr>
       <w:pBdr>
-        <w:top w:val="single" w:color="E8990C" w:sz="18"/>
+        <w:top w:val="single" w:color="C9973B" w:sz="18"/>
       </w:pBdr>
       <w:spacing w:before="60"/>
       <w:jc w:val="center"/>
@@ -562,7 +562,7 @@
   <w:p>
     <w:pPr>
       <w:pBdr>
-        <w:bottom w:val="single" w:color="E8990C" w:sz="32"/>
+        <w:bottom w:val="single" w:color="C9973B" w:sz="32"/>
       </w:pBdr>
       <w:spacing w:after="0" w:before="120"/>
     </w:pPr>

</xml_diff>